<commit_message>
Add switch mode to the simulatoin : Regular mode - generate data from known distribution | Empiracal mode - generate data from distribution base on real data
</commit_message>
<xml_diff>
--- a/fire_emergency_simulation/fire_emergency_OG/Explanation.docx
+++ b/fire_emergency_simulation/fire_emergency_OG/Explanation.docx
@@ -550,19 +550,7 @@
         <w:rPr>
           <w:lang w:val="en-US"/>
         </w:rPr>
-        <w:t>Every time you run</w:t>
-      </w:r>
-      <w:r>
-        <w:rPr>
-          <w:lang w:val="en-US"/>
-        </w:rPr>
-        <w:t xml:space="preserve"> it</w:t>
-      </w:r>
-      <w:r>
-        <w:rPr>
-          <w:lang w:val="en-US"/>
-        </w:rPr>
-        <w:t xml:space="preserve"> it’s creating a new folder with the date and the time and  will be save in it all the excel .</w:t>
+        <w:t>Every time you run it it’s creating a new folder with the date and the time and  will be save in it all the excel .</w:t>
       </w:r>
     </w:p>
     <w:p>
@@ -657,9 +645,6 @@
           <w:ilvl w:val="0"/>
           <w:numId w:val="15"/>
         </w:numPr>
-        <w:rPr>
-          <w:lang w:val="en-IL"/>
-        </w:rPr>
       </w:pPr>
       <w:r>
         <w:rPr>
@@ -668,15 +653,9 @@
         <w:t xml:space="preserve">Copy and past the </w:t>
       </w:r>
       <w:r>
-        <w:rPr>
-          <w:lang w:val="en-IL"/>
-        </w:rPr>
         <w:t>excel result_project.xlsx in the folder project</w:t>
       </w:r>
       <w:r>
-        <w:rPr>
-          <w:lang w:val="en-IL"/>
-        </w:rPr>
         <w:t xml:space="preserve"> :</w:t>
       </w:r>
       <w:r>
@@ -1436,6 +1415,802 @@
     </w:p>
     <w:p>
       <w:pPr>
+        <w:rPr>
+          <w:lang w:val="en-US"/>
+        </w:rPr>
+      </w:pPr>
+      <w:r>
+        <w:rPr>
+          <w:lang w:val="en-US"/>
+        </w:rPr>
+        <w:br w:type="page"/>
+      </w:r>
+    </w:p>
+    <w:p>
+      <w:pPr>
+        <w:spacing w:after="0"/>
+        <w:rPr>
+          <w:lang w:val="en-US"/>
+        </w:rPr>
+      </w:pPr>
+      <w:r>
+        <w:rPr>
+          <w:lang w:val="en-US"/>
+        </w:rPr>
+        <w:t xml:space="preserve">Run </w:t>
+      </w:r>
+    </w:p>
+    <w:p>
+      <w:pPr>
+        <w:spacing w:after="0"/>
+        <w:rPr>
+          <w:b/>
+          <w:bCs/>
+          <w:lang w:val="en-US"/>
+        </w:rPr>
+      </w:pPr>
+      <w:r>
+        <w:rPr>
+          <w:b/>
+          <w:bCs/>
+          <w:lang w:val="en-US"/>
+        </w:rPr>
+        <w:t>main.py:</w:t>
+      </w:r>
+    </w:p>
+    <w:p>
+      <w:pPr>
+        <w:pStyle w:val="ListParagraph"/>
+        <w:numPr>
+          <w:ilvl w:val="0"/>
+          <w:numId w:val="20"/>
+        </w:numPr>
+        <w:spacing w:after="0"/>
+        <w:rPr>
+          <w:lang w:val="en-IL"/>
+        </w:rPr>
+      </w:pPr>
+      <w:r>
+        <w:rPr>
+          <w:lang w:val="en-IL"/>
+        </w:rPr>
+        <w:t>run_simulation_and_heat_map</w:t>
+      </w:r>
+      <w:r>
+        <w:rPr>
+          <w:lang w:val="en-IL"/>
+        </w:rPr>
+        <w:t xml:space="preserve"> – for the regular sim </w:t>
+      </w:r>
+    </w:p>
+    <w:p>
+      <w:pPr>
+        <w:spacing w:after="0"/>
+        <w:rPr>
+          <w:lang w:val="en-IL"/>
+        </w:rPr>
+      </w:pPr>
+    </w:p>
+    <w:p>
+      <w:pPr>
+        <w:spacing w:after="0"/>
+        <w:rPr>
+          <w:b/>
+          <w:bCs/>
+          <w:lang w:val="en-IL"/>
+        </w:rPr>
+      </w:pPr>
+      <w:r>
+        <w:rPr>
+          <w:b/>
+          <w:bCs/>
+          <w:lang w:val="en-IL"/>
+        </w:rPr>
+        <w:t>result_project.py:</w:t>
+      </w:r>
+    </w:p>
+    <w:p>
+      <w:pPr>
+        <w:pStyle w:val="ListParagraph"/>
+        <w:numPr>
+          <w:ilvl w:val="0"/>
+          <w:numId w:val="19"/>
+        </w:numPr>
+        <w:spacing w:after="0"/>
+        <w:rPr>
+          <w:lang w:val="en-IL"/>
+        </w:rPr>
+      </w:pPr>
+      <w:r>
+        <w:rPr>
+          <w:lang w:val="en-IL"/>
+        </w:rPr>
+        <w:t>get_final_results</w:t>
+      </w:r>
+    </w:p>
+    <w:p>
+      <w:pPr>
+        <w:pStyle w:val="ListParagraph"/>
+        <w:numPr>
+          <w:ilvl w:val="0"/>
+          <w:numId w:val="19"/>
+        </w:numPr>
+        <w:spacing w:after="0"/>
+        <w:rPr>
+          <w:lang w:val="en-IL"/>
+        </w:rPr>
+      </w:pPr>
+      <w:r>
+        <w:rPr>
+          <w:lang w:val="en-IL"/>
+        </w:rPr>
+        <w:t>run_simulation_for_cell(</w:t>
+      </w:r>
+      <w:proofErr w:type="spellStart"/>
+      <w:r>
+        <w:rPr>
+          <w:lang w:val="en-IL"/>
+        </w:rPr>
+        <w:t>interval_range</w:t>
+      </w:r>
+      <w:proofErr w:type="spellEnd"/>
+      <w:r>
+        <w:rPr>
+          <w:lang w:val="en-IL"/>
+        </w:rPr>
+        <w:t xml:space="preserve">, </w:t>
+      </w:r>
+      <w:proofErr w:type="spellStart"/>
+      <w:r>
+        <w:rPr>
+          <w:lang w:val="en-IL"/>
+        </w:rPr>
+        <w:t>total_service_range</w:t>
+      </w:r>
+      <w:proofErr w:type="spellEnd"/>
+      <w:r>
+        <w:rPr>
+          <w:lang w:val="en-IL"/>
+        </w:rPr>
+        <w:t>)</w:t>
+      </w:r>
+    </w:p>
+    <w:p>
+      <w:pPr>
+        <w:spacing w:after="0"/>
+        <w:rPr>
+          <w:lang w:val="en-IL"/>
+        </w:rPr>
+      </w:pPr>
+    </w:p>
+    <w:p>
+      <w:pPr>
+        <w:spacing w:after="0"/>
+        <w:rPr>
+          <w:b/>
+          <w:bCs/>
+          <w:lang w:val="en-IL"/>
+        </w:rPr>
+      </w:pPr>
+      <w:r>
+        <w:rPr>
+          <w:b/>
+          <w:bCs/>
+          <w:lang w:val="en-IL"/>
+        </w:rPr>
+        <w:t>project.py:</w:t>
+      </w:r>
+    </w:p>
+    <w:p>
+      <w:pPr>
+        <w:pStyle w:val="ListParagraph"/>
+        <w:numPr>
+          <w:ilvl w:val="0"/>
+          <w:numId w:val="17"/>
+        </w:numPr>
+        <w:spacing w:after="0"/>
+        <w:rPr>
+          <w:lang w:val="en-IL"/>
+        </w:rPr>
+      </w:pPr>
+      <w:r>
+        <w:rPr>
+          <w:lang w:val="en-IL"/>
+        </w:rPr>
+        <w:t>start_</w:t>
+      </w:r>
+      <w:r>
+        <w:rPr>
+          <w:lang w:val="en-IL"/>
+        </w:rPr>
+        <w:t>project(</w:t>
+      </w:r>
+      <w:proofErr w:type="spellStart"/>
+      <w:r>
+        <w:rPr>
+          <w:lang w:val="en-IL"/>
+        </w:rPr>
+        <w:t>interval_range</w:t>
+      </w:r>
+      <w:proofErr w:type="spellEnd"/>
+      <w:r>
+        <w:rPr>
+          <w:lang w:val="en-IL"/>
+        </w:rPr>
+        <w:t xml:space="preserve">, </w:t>
+      </w:r>
+      <w:proofErr w:type="spellStart"/>
+      <w:r>
+        <w:rPr>
+          <w:lang w:val="en-IL"/>
+        </w:rPr>
+        <w:t>service_range</w:t>
+      </w:r>
+      <w:proofErr w:type="spellEnd"/>
+      <w:r>
+        <w:rPr>
+          <w:lang w:val="en-IL"/>
+        </w:rPr>
+        <w:t xml:space="preserve">, </w:t>
+      </w:r>
+      <w:proofErr w:type="spellStart"/>
+      <w:r>
+        <w:rPr>
+          <w:lang w:val="en-IL"/>
+        </w:rPr>
+        <w:t>response_range</w:t>
+      </w:r>
+      <w:proofErr w:type="spellEnd"/>
+      <w:r>
+        <w:rPr>
+          <w:lang w:val="en-IL"/>
+        </w:rPr>
+        <w:t>, mode</w:t>
+      </w:r>
+      <w:r>
+        <w:rPr>
+          <w:lang w:val="en-IL"/>
+        </w:rPr>
+        <w:t>)</w:t>
+      </w:r>
+    </w:p>
+    <w:p>
+      <w:pPr>
+        <w:pStyle w:val="ListParagraph"/>
+        <w:numPr>
+          <w:ilvl w:val="0"/>
+          <w:numId w:val="17"/>
+        </w:numPr>
+        <w:spacing w:after="0"/>
+        <w:rPr>
+          <w:lang w:val="en-IL"/>
+        </w:rPr>
+      </w:pPr>
+      <w:r>
+        <w:rPr>
+          <w:lang w:val="en-IL"/>
+        </w:rPr>
+        <w:t>get_results_of_sets(</w:t>
+      </w:r>
+      <w:proofErr w:type="spellStart"/>
+      <w:r>
+        <w:rPr>
+          <w:lang w:val="en-IL"/>
+        </w:rPr>
+        <w:t>interval_range</w:t>
+      </w:r>
+      <w:proofErr w:type="spellEnd"/>
+      <w:r>
+        <w:rPr>
+          <w:lang w:val="en-IL"/>
+        </w:rPr>
+        <w:t xml:space="preserve">, </w:t>
+      </w:r>
+      <w:proofErr w:type="spellStart"/>
+      <w:r>
+        <w:rPr>
+          <w:lang w:val="en-IL"/>
+        </w:rPr>
+        <w:t>service_range</w:t>
+      </w:r>
+      <w:proofErr w:type="spellEnd"/>
+      <w:r>
+        <w:rPr>
+          <w:lang w:val="en-IL"/>
+        </w:rPr>
+        <w:t xml:space="preserve">, </w:t>
+      </w:r>
+      <w:proofErr w:type="spellStart"/>
+      <w:r>
+        <w:rPr>
+          <w:lang w:val="en-IL"/>
+        </w:rPr>
+        <w:t>response_range</w:t>
+      </w:r>
+      <w:proofErr w:type="spellEnd"/>
+      <w:r>
+        <w:rPr>
+          <w:lang w:val="en-IL"/>
+        </w:rPr>
+        <w:t>, mode</w:t>
+      </w:r>
+      <w:r>
+        <w:rPr>
+          <w:lang w:val="en-IL"/>
+        </w:rPr>
+        <w:t>)</w:t>
+      </w:r>
+    </w:p>
+    <w:p>
+      <w:pPr>
+        <w:pStyle w:val="ListParagraph"/>
+        <w:numPr>
+          <w:ilvl w:val="2"/>
+          <w:numId w:val="17"/>
+        </w:numPr>
+        <w:spacing w:after="0"/>
+        <w:rPr>
+          <w:lang w:val="en-IL"/>
+        </w:rPr>
+      </w:pPr>
+      <w:r>
+        <w:rPr>
+          <w:lang w:val="en-IL"/>
+        </w:rPr>
+        <w:t>mode.</w:t>
+      </w:r>
+      <w:r>
+        <w:rPr>
+          <w:lang w:val="en-IL"/>
+        </w:rPr>
+        <w:t>generate_time_parameters(</w:t>
+      </w:r>
+      <w:proofErr w:type="spellStart"/>
+      <w:r>
+        <w:rPr>
+          <w:lang w:val="en-IL"/>
+        </w:rPr>
+        <w:t>interval_range</w:t>
+      </w:r>
+      <w:proofErr w:type="spellEnd"/>
+      <w:r>
+        <w:rPr>
+          <w:lang w:val="en-IL"/>
+        </w:rPr>
+        <w:t xml:space="preserve">, </w:t>
+      </w:r>
+      <w:proofErr w:type="spellStart"/>
+      <w:r>
+        <w:rPr>
+          <w:lang w:val="en-IL"/>
+        </w:rPr>
+        <w:t>service_range</w:t>
+      </w:r>
+      <w:proofErr w:type="spellEnd"/>
+      <w:r>
+        <w:rPr>
+          <w:lang w:val="en-IL"/>
+        </w:rPr>
+        <w:t xml:space="preserve">, </w:t>
+      </w:r>
+      <w:proofErr w:type="spellStart"/>
+      <w:r>
+        <w:rPr>
+          <w:lang w:val="en-IL"/>
+        </w:rPr>
+        <w:t>response_range</w:t>
+      </w:r>
+      <w:proofErr w:type="spellEnd"/>
+      <w:r>
+        <w:rPr>
+          <w:lang w:val="en-IL"/>
+        </w:rPr>
+        <w:t>)</w:t>
+      </w:r>
+    </w:p>
+    <w:p>
+      <w:pPr>
+        <w:pStyle w:val="ListParagraph"/>
+        <w:numPr>
+          <w:ilvl w:val="2"/>
+          <w:numId w:val="17"/>
+        </w:numPr>
+        <w:spacing w:after="0"/>
+        <w:rPr>
+          <w:lang w:val="en-IL"/>
+        </w:rPr>
+      </w:pPr>
+      <w:r>
+        <w:rPr>
+          <w:lang w:val="en-IL"/>
+        </w:rPr>
+        <w:t>mode.</w:t>
+      </w:r>
+      <w:r>
+        <w:rPr>
+          <w:lang w:val="en-IL"/>
+        </w:rPr>
+        <w:t>generate_vehicles(</w:t>
+      </w:r>
+      <w:proofErr w:type="spellStart"/>
+      <w:r>
+        <w:rPr>
+          <w:lang w:val="en-IL"/>
+        </w:rPr>
+        <w:t>time_parameter_set</w:t>
+      </w:r>
+      <w:proofErr w:type="spellEnd"/>
+      <w:r>
+        <w:rPr>
+          <w:lang w:val="en-IL"/>
+        </w:rPr>
+        <w:t>)</w:t>
+      </w:r>
+    </w:p>
+    <w:p>
+      <w:pPr>
+        <w:pStyle w:val="ListParagraph"/>
+        <w:numPr>
+          <w:ilvl w:val="2"/>
+          <w:numId w:val="17"/>
+        </w:numPr>
+        <w:spacing w:after="0"/>
+        <w:rPr>
+          <w:lang w:val="en-IL"/>
+        </w:rPr>
+      </w:pPr>
+      <w:r>
+        <w:rPr>
+          <w:lang w:val="en-IL"/>
+        </w:rPr>
+        <w:t xml:space="preserve">run_replications(vehicles, </w:t>
+      </w:r>
+      <w:proofErr w:type="spellStart"/>
+      <w:r>
+        <w:rPr>
+          <w:lang w:val="en-IL"/>
+        </w:rPr>
+        <w:t>time_parameter_set</w:t>
+      </w:r>
+      <w:proofErr w:type="spellEnd"/>
+      <w:r>
+        <w:rPr>
+          <w:lang w:val="en-IL"/>
+        </w:rPr>
+        <w:t>, mode)</w:t>
+      </w:r>
+    </w:p>
+    <w:p>
+      <w:pPr>
+        <w:pStyle w:val="ListParagraph"/>
+        <w:numPr>
+          <w:ilvl w:val="0"/>
+          <w:numId w:val="17"/>
+        </w:numPr>
+        <w:spacing w:after="0"/>
+        <w:rPr>
+          <w:lang w:val="en-IL"/>
+        </w:rPr>
+      </w:pPr>
+      <w:r>
+        <w:rPr>
+          <w:lang w:val="en-IL"/>
+        </w:rPr>
+        <w:t xml:space="preserve">run_replications(vehicles: list, </w:t>
+      </w:r>
+      <w:proofErr w:type="spellStart"/>
+      <w:r>
+        <w:rPr>
+          <w:lang w:val="en-IL"/>
+        </w:rPr>
+        <w:t>time_parameter_set</w:t>
+      </w:r>
+      <w:proofErr w:type="spellEnd"/>
+      <w:r>
+        <w:rPr>
+          <w:lang w:val="en-IL"/>
+        </w:rPr>
+        <w:t xml:space="preserve">, </w:t>
+      </w:r>
+      <w:proofErr w:type="spellStart"/>
+      <w:r>
+        <w:rPr>
+          <w:lang w:val="en-IL"/>
+        </w:rPr>
+        <w:t>mode:BaseExperimentMode</w:t>
+      </w:r>
+      <w:proofErr w:type="spellEnd"/>
+      <w:r>
+        <w:rPr>
+          <w:lang w:val="en-IL"/>
+        </w:rPr>
+        <w:t>)</w:t>
+      </w:r>
+    </w:p>
+    <w:p>
+      <w:pPr>
+        <w:pStyle w:val="ListParagraph"/>
+        <w:numPr>
+          <w:ilvl w:val="2"/>
+          <w:numId w:val="17"/>
+        </w:numPr>
+        <w:spacing w:after="0"/>
+        <w:rPr>
+          <w:lang w:val="en-IL"/>
+        </w:rPr>
+      </w:pPr>
+      <w:r>
+        <w:rPr>
+          <w:lang w:val="en-IL"/>
+        </w:rPr>
+        <w:t>mode.generate_precomputed_times(</w:t>
+      </w:r>
+      <w:proofErr w:type="spellStart"/>
+      <w:r>
+        <w:rPr>
+          <w:lang w:val="en-IL"/>
+        </w:rPr>
+        <w:t>time_parameter_set</w:t>
+      </w:r>
+      <w:proofErr w:type="spellEnd"/>
+      <w:r>
+        <w:rPr>
+          <w:lang w:val="en-IL"/>
+        </w:rPr>
+        <w:t>)</w:t>
+      </w:r>
+    </w:p>
+    <w:p>
+      <w:pPr>
+        <w:pStyle w:val="ListParagraph"/>
+        <w:numPr>
+          <w:ilvl w:val="2"/>
+          <w:numId w:val="17"/>
+        </w:numPr>
+        <w:spacing w:after="0"/>
+        <w:rPr>
+          <w:lang w:val="en-IL"/>
+        </w:rPr>
+      </w:pPr>
+      <w:r>
+        <w:rPr>
+          <w:lang w:val="en-IL"/>
+        </w:rPr>
+        <w:t xml:space="preserve">run_simulation_with_policies(vehicles, precomputed, </w:t>
+      </w:r>
+      <w:proofErr w:type="spellStart"/>
+      <w:r>
+        <w:rPr>
+          <w:lang w:val="en-IL"/>
+        </w:rPr>
+        <w:t>all_policies</w:t>
+      </w:r>
+      <w:proofErr w:type="spellEnd"/>
+      <w:r>
+        <w:rPr>
+          <w:lang w:val="en-IL"/>
+        </w:rPr>
+        <w:t>, mode)</w:t>
+      </w:r>
+    </w:p>
+    <w:p>
+      <w:pPr>
+        <w:pStyle w:val="ListParagraph"/>
+        <w:numPr>
+          <w:ilvl w:val="2"/>
+          <w:numId w:val="17"/>
+        </w:numPr>
+        <w:spacing w:after="0"/>
+        <w:rPr>
+          <w:lang w:val="en-IL"/>
+        </w:rPr>
+      </w:pPr>
+      <w:r>
+        <w:rPr>
+          <w:lang w:val="en-IL"/>
+        </w:rPr>
+        <w:t>summarize_replication_results(p1_results, p2_results, name)</w:t>
+      </w:r>
+    </w:p>
+    <w:p>
+      <w:pPr>
+        <w:pStyle w:val="ListParagraph"/>
+        <w:numPr>
+          <w:ilvl w:val="0"/>
+          <w:numId w:val="17"/>
+        </w:numPr>
+        <w:spacing w:after="0"/>
+        <w:rPr>
+          <w:lang w:val="en-IL"/>
+        </w:rPr>
+      </w:pPr>
+      <w:r>
+        <w:rPr>
+          <w:lang w:val="en-IL"/>
+        </w:rPr>
+        <w:t xml:space="preserve">run_simulation_with_policies(vehicles, precomputed, </w:t>
+      </w:r>
+      <w:proofErr w:type="spellStart"/>
+      <w:r>
+        <w:rPr>
+          <w:lang w:val="en-IL"/>
+        </w:rPr>
+        <w:t>all_policies</w:t>
+      </w:r>
+      <w:proofErr w:type="spellEnd"/>
+      <w:r>
+        <w:rPr>
+          <w:lang w:val="en-IL"/>
+        </w:rPr>
+        <w:t>, mode)</w:t>
+      </w:r>
+    </w:p>
+    <w:p>
+      <w:pPr>
+        <w:pStyle w:val="ListParagraph"/>
+        <w:numPr>
+          <w:ilvl w:val="0"/>
+          <w:numId w:val="17"/>
+        </w:numPr>
+        <w:spacing w:after="0"/>
+        <w:rPr>
+          <w:lang w:val="en-IL"/>
+        </w:rPr>
+      </w:pPr>
+      <w:r>
+        <w:rPr>
+          <w:lang w:val="en-IL"/>
+        </w:rPr>
+        <w:t>sim.run(</w:t>
+      </w:r>
+      <w:proofErr w:type="spellStart"/>
+      <w:r>
+        <w:rPr>
+          <w:lang w:val="en-IL"/>
+        </w:rPr>
+        <w:t>simulation_time</w:t>
+      </w:r>
+      <w:proofErr w:type="spellEnd"/>
+      <w:r>
+        <w:rPr>
+          <w:lang w:val="en-IL"/>
+        </w:rPr>
+        <w:t>)</w:t>
+      </w:r>
+    </w:p>
+    <w:p>
+      <w:pPr>
+        <w:spacing w:after="0"/>
+        <w:rPr>
+          <w:lang w:val="en-IL"/>
+        </w:rPr>
+      </w:pPr>
+    </w:p>
+    <w:p>
+      <w:pPr>
+        <w:spacing w:after="0"/>
+        <w:rPr>
+          <w:b/>
+          <w:bCs/>
+          <w:lang w:val="en-IL"/>
+        </w:rPr>
+      </w:pPr>
+      <w:r>
+        <w:rPr>
+          <w:b/>
+          <w:bCs/>
+          <w:lang w:val="en-IL"/>
+        </w:rPr>
+        <w:t>simulation.py:</w:t>
+      </w:r>
+    </w:p>
+    <w:p>
+      <w:pPr>
+        <w:pStyle w:val="ListParagraph"/>
+        <w:numPr>
+          <w:ilvl w:val="0"/>
+          <w:numId w:val="18"/>
+        </w:numPr>
+        <w:spacing w:after="0"/>
+        <w:rPr>
+          <w:lang w:val="en-IL"/>
+        </w:rPr>
+      </w:pPr>
+      <w:r>
+        <w:rPr>
+          <w:lang w:val="en-IL"/>
+        </w:rPr>
+        <w:t>run(</w:t>
+      </w:r>
+      <w:proofErr w:type="spellStart"/>
+      <w:r>
+        <w:rPr>
+          <w:lang w:val="en-IL"/>
+        </w:rPr>
+        <w:t>simulation_time</w:t>
+      </w:r>
+      <w:proofErr w:type="spellEnd"/>
+      <w:r>
+        <w:rPr>
+          <w:lang w:val="en-IL"/>
+        </w:rPr>
+        <w:t>)</w:t>
+      </w:r>
+    </w:p>
+    <w:p>
+      <w:pPr>
+        <w:spacing w:after="0"/>
+        <w:rPr>
+          <w:b/>
+          <w:bCs/>
+          <w:lang w:val="en-IL"/>
+        </w:rPr>
+      </w:pPr>
+    </w:p>
+    <w:p>
+      <w:pPr>
+        <w:spacing w:after="0"/>
+        <w:rPr>
+          <w:lang w:val="en-IL"/>
+        </w:rPr>
+      </w:pPr>
+    </w:p>
+    <w:p>
+      <w:pPr>
+        <w:spacing w:after="0"/>
+        <w:rPr>
+          <w:lang w:val="en-IL"/>
+        </w:rPr>
+      </w:pPr>
+    </w:p>
+    <w:p>
+      <w:pPr>
+        <w:spacing w:after="0"/>
+        <w:rPr>
+          <w:lang w:val="en-IL"/>
+        </w:rPr>
+      </w:pPr>
+    </w:p>
+    <w:p>
+      <w:pPr>
+        <w:spacing w:after="0"/>
+        <w:rPr>
+          <w:lang w:val="en-IL"/>
+        </w:rPr>
+      </w:pPr>
+      <w:r>
+        <w:rPr>
+          <w:lang w:val="en-IL"/>
+        </w:rPr>
+        <w:t xml:space="preserve"> </w:t>
+      </w:r>
+    </w:p>
+    <w:p>
+      <w:pPr>
+        <w:spacing w:after="0"/>
+        <w:rPr>
+          <w:lang w:val="en-IL"/>
+        </w:rPr>
+      </w:pPr>
+    </w:p>
+    <w:p>
+      <w:pPr>
+        <w:spacing w:after="0"/>
+        <w:rPr>
+          <w:lang w:val="en-IL"/>
+        </w:rPr>
+      </w:pPr>
+    </w:p>
+    <w:p>
+      <w:pPr>
+        <w:spacing w:after="0"/>
+        <w:rPr>
+          <w:lang w:val="en-US"/>
+        </w:rPr>
+      </w:pPr>
+    </w:p>
+    <w:p>
+      <w:pPr>
         <w:spacing w:after="0"/>
         <w:rPr>
           <w:lang w:val="en-US"/>
@@ -1464,6 +2239,92 @@
 <file path=word/numbering.xml><?xml version="1.0" encoding="utf-8"?>
 <w:numbering xmlns:wpc="http://schemas.microsoft.com/office/word/2010/wordprocessingCanvas" xmlns:cx="http://schemas.microsoft.com/office/drawing/2014/chartex" xmlns:cx1="http://schemas.microsoft.com/office/drawing/2015/9/8/chartex" xmlns:cx2="http://schemas.microsoft.com/office/drawing/2015/10/21/chartex" xmlns:cx3="http://schemas.microsoft.com/office/drawing/2016/5/9/chartex" xmlns:cx4="http://schemas.microsoft.com/office/drawing/2016/5/10/chartex" xmlns:cx5="http://schemas.microsoft.com/office/drawing/2016/5/11/chartex" xmlns:cx6="http://schemas.microsoft.com/office/drawing/2016/5/12/chartex" xmlns:cx7="http://schemas.microsoft.com/office/drawing/2016/5/13/chartex" xmlns:cx8="http://schemas.microsoft.com/office/drawing/2016/5/14/chartex" xmlns:mc="http://schemas.openxmlformats.org/markup-compatibility/2006" xmlns:aink="http://schemas.microsoft.com/office/drawing/2016/ink" xmlns:am3d="http://schemas.microsoft.com/office/drawing/2017/model3d" xmlns:o="urn:schemas-microsoft-com:office:office" xmlns:oel="http://schemas.microsoft.com/office/2019/extlst" xmlns:r="http://schemas.openxmlformats.org/officeDocument/2006/relationships" xmlns:m="http://schemas.openxmlformats.org/officeDocument/2006/math" xmlns:v="urn:schemas-microsoft-com:vml" xmlns:wp14="http://schemas.microsoft.com/office/word/2010/wordprocessingDrawing" xmlns:wp="http://schemas.openxmlformats.org/drawingml/2006/wordprocessingDrawing" xmlns:w10="urn:schemas-microsoft-com:office:word" xmlns:w="http://schemas.openxmlformats.org/wordprocessingml/2006/main" xmlns:w14="http://schemas.microsoft.com/office/word/2010/wordml" xmlns:w15="http://schemas.microsoft.com/office/word/2012/wordml" xmlns:w16cex="http://schemas.microsoft.com/office/word/2018/wordml/cex" xmlns:w16cid="http://schemas.microsoft.com/office/word/2016/wordml/cid" xmlns:w16="http://schemas.microsoft.com/office/word/2018/wordml" xmlns:w16du="http://schemas.microsoft.com/office/word/2023/wordml/word16du" xmlns:w16sdtdh="http://schemas.microsoft.com/office/word/2020/wordml/sdtdatahash" xmlns:w16sdtfl="http://schemas.microsoft.com/office/word/2024/wordml/sdtformatlock" xmlns:w16se="http://schemas.microsoft.com/office/word/2015/wordml/symex" xmlns:wpg="http://schemas.microsoft.com/office/word/2010/wordprocessingGroup" xmlns:wpi="http://schemas.microsoft.com/office/word/2010/wordprocessingInk" xmlns:wne="http://schemas.microsoft.com/office/word/2006/wordml" xmlns:wps="http://schemas.microsoft.com/office/word/2010/wordprocessingShape" mc:Ignorable="w14 w15 w16se w16cid w16 w16cex w16sdtdh w16sdtfl w16du wp14">
   <w:abstractNum w:abstractNumId="0" w15:restartNumberingAfterBreak="0">
+    <w:nsid w:val="068673D1"/>
+    <w:multiLevelType w:val="hybridMultilevel"/>
+    <w:tmpl w:val="C0A876BE"/>
+    <w:lvl w:ilvl="0" w:tplc="2000000F">
+      <w:start w:val="1"/>
+      <w:numFmt w:val="decimal"/>
+      <w:lvlText w:val="%1."/>
+      <w:lvlJc w:val="left"/>
+      <w:pPr>
+        <w:ind w:left="720" w:hanging="360"/>
+      </w:pPr>
+    </w:lvl>
+    <w:lvl w:ilvl="1" w:tplc="20000019">
+      <w:start w:val="1"/>
+      <w:numFmt w:val="lowerLetter"/>
+      <w:lvlText w:val="%2."/>
+      <w:lvlJc w:val="left"/>
+      <w:pPr>
+        <w:ind w:left="1440" w:hanging="360"/>
+      </w:pPr>
+    </w:lvl>
+    <w:lvl w:ilvl="2" w:tplc="2000001B">
+      <w:start w:val="1"/>
+      <w:numFmt w:val="lowerRoman"/>
+      <w:lvlText w:val="%3."/>
+      <w:lvlJc w:val="right"/>
+      <w:pPr>
+        <w:ind w:left="2160" w:hanging="180"/>
+      </w:pPr>
+    </w:lvl>
+    <w:lvl w:ilvl="3" w:tplc="2000000F" w:tentative="1">
+      <w:start w:val="1"/>
+      <w:numFmt w:val="decimal"/>
+      <w:lvlText w:val="%4."/>
+      <w:lvlJc w:val="left"/>
+      <w:pPr>
+        <w:ind w:left="2880" w:hanging="360"/>
+      </w:pPr>
+    </w:lvl>
+    <w:lvl w:ilvl="4" w:tplc="20000019" w:tentative="1">
+      <w:start w:val="1"/>
+      <w:numFmt w:val="lowerLetter"/>
+      <w:lvlText w:val="%5."/>
+      <w:lvlJc w:val="left"/>
+      <w:pPr>
+        <w:ind w:left="3600" w:hanging="360"/>
+      </w:pPr>
+    </w:lvl>
+    <w:lvl w:ilvl="5" w:tplc="2000001B" w:tentative="1">
+      <w:start w:val="1"/>
+      <w:numFmt w:val="lowerRoman"/>
+      <w:lvlText w:val="%6."/>
+      <w:lvlJc w:val="right"/>
+      <w:pPr>
+        <w:ind w:left="4320" w:hanging="180"/>
+      </w:pPr>
+    </w:lvl>
+    <w:lvl w:ilvl="6" w:tplc="2000000F" w:tentative="1">
+      <w:start w:val="1"/>
+      <w:numFmt w:val="decimal"/>
+      <w:lvlText w:val="%7."/>
+      <w:lvlJc w:val="left"/>
+      <w:pPr>
+        <w:ind w:left="5040" w:hanging="360"/>
+      </w:pPr>
+    </w:lvl>
+    <w:lvl w:ilvl="7" w:tplc="20000019" w:tentative="1">
+      <w:start w:val="1"/>
+      <w:numFmt w:val="lowerLetter"/>
+      <w:lvlText w:val="%8."/>
+      <w:lvlJc w:val="left"/>
+      <w:pPr>
+        <w:ind w:left="5760" w:hanging="360"/>
+      </w:pPr>
+    </w:lvl>
+    <w:lvl w:ilvl="8" w:tplc="2000001B" w:tentative="1">
+      <w:start w:val="1"/>
+      <w:numFmt w:val="lowerRoman"/>
+      <w:lvlText w:val="%9."/>
+      <w:lvlJc w:val="right"/>
+      <w:pPr>
+        <w:ind w:left="6480" w:hanging="180"/>
+      </w:pPr>
+    </w:lvl>
+  </w:abstractNum>
+  <w:abstractNum w:abstractNumId="1" w15:restartNumberingAfterBreak="0">
     <w:nsid w:val="07B9730A"/>
     <w:multiLevelType w:val="hybridMultilevel"/>
     <w:tmpl w:val="F88825AC"/>
@@ -1576,7 +2437,7 @@
       </w:rPr>
     </w:lvl>
   </w:abstractNum>
-  <w:abstractNum w:abstractNumId="1" w15:restartNumberingAfterBreak="0">
+  <w:abstractNum w:abstractNumId="2" w15:restartNumberingAfterBreak="0">
     <w:nsid w:val="0BCA74AC"/>
     <w:multiLevelType w:val="hybridMultilevel"/>
     <w:tmpl w:val="136459C2"/>
@@ -1689,7 +2550,7 @@
       </w:rPr>
     </w:lvl>
   </w:abstractNum>
-  <w:abstractNum w:abstractNumId="2" w15:restartNumberingAfterBreak="0">
+  <w:abstractNum w:abstractNumId="3" w15:restartNumberingAfterBreak="0">
     <w:nsid w:val="18BE6886"/>
     <w:multiLevelType w:val="hybridMultilevel"/>
     <w:tmpl w:val="EB0CE472"/>
@@ -1778,7 +2639,7 @@
       </w:pPr>
     </w:lvl>
   </w:abstractNum>
-  <w:abstractNum w:abstractNumId="3" w15:restartNumberingAfterBreak="0">
+  <w:abstractNum w:abstractNumId="4" w15:restartNumberingAfterBreak="0">
     <w:nsid w:val="1B3504C4"/>
     <w:multiLevelType w:val="hybridMultilevel"/>
     <w:tmpl w:val="05D64FFC"/>
@@ -1891,7 +2752,7 @@
       </w:rPr>
     </w:lvl>
   </w:abstractNum>
-  <w:abstractNum w:abstractNumId="4" w15:restartNumberingAfterBreak="0">
+  <w:abstractNum w:abstractNumId="5" w15:restartNumberingAfterBreak="0">
     <w:nsid w:val="1BA675F1"/>
     <w:multiLevelType w:val="hybridMultilevel"/>
     <w:tmpl w:val="C3CAC708"/>
@@ -2004,7 +2865,179 @@
       </w:rPr>
     </w:lvl>
   </w:abstractNum>
-  <w:abstractNum w:abstractNumId="5" w15:restartNumberingAfterBreak="0">
+  <w:abstractNum w:abstractNumId="6" w15:restartNumberingAfterBreak="0">
+    <w:nsid w:val="277E349D"/>
+    <w:multiLevelType w:val="hybridMultilevel"/>
+    <w:tmpl w:val="C0A876BE"/>
+    <w:lvl w:ilvl="0" w:tplc="FFFFFFFF">
+      <w:start w:val="1"/>
+      <w:numFmt w:val="decimal"/>
+      <w:lvlText w:val="%1."/>
+      <w:lvlJc w:val="left"/>
+      <w:pPr>
+        <w:ind w:left="720" w:hanging="360"/>
+      </w:pPr>
+    </w:lvl>
+    <w:lvl w:ilvl="1" w:tplc="FFFFFFFF">
+      <w:start w:val="1"/>
+      <w:numFmt w:val="lowerLetter"/>
+      <w:lvlText w:val="%2."/>
+      <w:lvlJc w:val="left"/>
+      <w:pPr>
+        <w:ind w:left="1440" w:hanging="360"/>
+      </w:pPr>
+    </w:lvl>
+    <w:lvl w:ilvl="2" w:tplc="FFFFFFFF">
+      <w:start w:val="1"/>
+      <w:numFmt w:val="lowerRoman"/>
+      <w:lvlText w:val="%3."/>
+      <w:lvlJc w:val="right"/>
+      <w:pPr>
+        <w:ind w:left="2160" w:hanging="180"/>
+      </w:pPr>
+    </w:lvl>
+    <w:lvl w:ilvl="3" w:tplc="FFFFFFFF" w:tentative="1">
+      <w:start w:val="1"/>
+      <w:numFmt w:val="decimal"/>
+      <w:lvlText w:val="%4."/>
+      <w:lvlJc w:val="left"/>
+      <w:pPr>
+        <w:ind w:left="2880" w:hanging="360"/>
+      </w:pPr>
+    </w:lvl>
+    <w:lvl w:ilvl="4" w:tplc="FFFFFFFF" w:tentative="1">
+      <w:start w:val="1"/>
+      <w:numFmt w:val="lowerLetter"/>
+      <w:lvlText w:val="%5."/>
+      <w:lvlJc w:val="left"/>
+      <w:pPr>
+        <w:ind w:left="3600" w:hanging="360"/>
+      </w:pPr>
+    </w:lvl>
+    <w:lvl w:ilvl="5" w:tplc="FFFFFFFF" w:tentative="1">
+      <w:start w:val="1"/>
+      <w:numFmt w:val="lowerRoman"/>
+      <w:lvlText w:val="%6."/>
+      <w:lvlJc w:val="right"/>
+      <w:pPr>
+        <w:ind w:left="4320" w:hanging="180"/>
+      </w:pPr>
+    </w:lvl>
+    <w:lvl w:ilvl="6" w:tplc="FFFFFFFF" w:tentative="1">
+      <w:start w:val="1"/>
+      <w:numFmt w:val="decimal"/>
+      <w:lvlText w:val="%7."/>
+      <w:lvlJc w:val="left"/>
+      <w:pPr>
+        <w:ind w:left="5040" w:hanging="360"/>
+      </w:pPr>
+    </w:lvl>
+    <w:lvl w:ilvl="7" w:tplc="FFFFFFFF" w:tentative="1">
+      <w:start w:val="1"/>
+      <w:numFmt w:val="lowerLetter"/>
+      <w:lvlText w:val="%8."/>
+      <w:lvlJc w:val="left"/>
+      <w:pPr>
+        <w:ind w:left="5760" w:hanging="360"/>
+      </w:pPr>
+    </w:lvl>
+    <w:lvl w:ilvl="8" w:tplc="FFFFFFFF" w:tentative="1">
+      <w:start w:val="1"/>
+      <w:numFmt w:val="lowerRoman"/>
+      <w:lvlText w:val="%9."/>
+      <w:lvlJc w:val="right"/>
+      <w:pPr>
+        <w:ind w:left="6480" w:hanging="180"/>
+      </w:pPr>
+    </w:lvl>
+  </w:abstractNum>
+  <w:abstractNum w:abstractNumId="7" w15:restartNumberingAfterBreak="0">
+    <w:nsid w:val="2EC56840"/>
+    <w:multiLevelType w:val="hybridMultilevel"/>
+    <w:tmpl w:val="66506A5C"/>
+    <w:lvl w:ilvl="0" w:tplc="FFFFFFFF">
+      <w:start w:val="1"/>
+      <w:numFmt w:val="decimal"/>
+      <w:lvlText w:val="%1."/>
+      <w:lvlJc w:val="left"/>
+      <w:pPr>
+        <w:ind w:left="720" w:hanging="360"/>
+      </w:pPr>
+    </w:lvl>
+    <w:lvl w:ilvl="1" w:tplc="20000019" w:tentative="1">
+      <w:start w:val="1"/>
+      <w:numFmt w:val="lowerLetter"/>
+      <w:lvlText w:val="%2."/>
+      <w:lvlJc w:val="left"/>
+      <w:pPr>
+        <w:ind w:left="1440" w:hanging="360"/>
+      </w:pPr>
+    </w:lvl>
+    <w:lvl w:ilvl="2" w:tplc="2000001B" w:tentative="1">
+      <w:start w:val="1"/>
+      <w:numFmt w:val="lowerRoman"/>
+      <w:lvlText w:val="%3."/>
+      <w:lvlJc w:val="right"/>
+      <w:pPr>
+        <w:ind w:left="2160" w:hanging="180"/>
+      </w:pPr>
+    </w:lvl>
+    <w:lvl w:ilvl="3" w:tplc="2000000F" w:tentative="1">
+      <w:start w:val="1"/>
+      <w:numFmt w:val="decimal"/>
+      <w:lvlText w:val="%4."/>
+      <w:lvlJc w:val="left"/>
+      <w:pPr>
+        <w:ind w:left="2880" w:hanging="360"/>
+      </w:pPr>
+    </w:lvl>
+    <w:lvl w:ilvl="4" w:tplc="20000019" w:tentative="1">
+      <w:start w:val="1"/>
+      <w:numFmt w:val="lowerLetter"/>
+      <w:lvlText w:val="%5."/>
+      <w:lvlJc w:val="left"/>
+      <w:pPr>
+        <w:ind w:left="3600" w:hanging="360"/>
+      </w:pPr>
+    </w:lvl>
+    <w:lvl w:ilvl="5" w:tplc="2000001B" w:tentative="1">
+      <w:start w:val="1"/>
+      <w:numFmt w:val="lowerRoman"/>
+      <w:lvlText w:val="%6."/>
+      <w:lvlJc w:val="right"/>
+      <w:pPr>
+        <w:ind w:left="4320" w:hanging="180"/>
+      </w:pPr>
+    </w:lvl>
+    <w:lvl w:ilvl="6" w:tplc="2000000F" w:tentative="1">
+      <w:start w:val="1"/>
+      <w:numFmt w:val="decimal"/>
+      <w:lvlText w:val="%7."/>
+      <w:lvlJc w:val="left"/>
+      <w:pPr>
+        <w:ind w:left="5040" w:hanging="360"/>
+      </w:pPr>
+    </w:lvl>
+    <w:lvl w:ilvl="7" w:tplc="20000019" w:tentative="1">
+      <w:start w:val="1"/>
+      <w:numFmt w:val="lowerLetter"/>
+      <w:lvlText w:val="%8."/>
+      <w:lvlJc w:val="left"/>
+      <w:pPr>
+        <w:ind w:left="5760" w:hanging="360"/>
+      </w:pPr>
+    </w:lvl>
+    <w:lvl w:ilvl="8" w:tplc="2000001B" w:tentative="1">
+      <w:start w:val="1"/>
+      <w:numFmt w:val="lowerRoman"/>
+      <w:lvlText w:val="%9."/>
+      <w:lvlJc w:val="right"/>
+      <w:pPr>
+        <w:ind w:left="6480" w:hanging="180"/>
+      </w:pPr>
+    </w:lvl>
+  </w:abstractNum>
+  <w:abstractNum w:abstractNumId="8" w15:restartNumberingAfterBreak="0">
     <w:nsid w:val="2F8F4B0B"/>
     <w:multiLevelType w:val="hybridMultilevel"/>
     <w:tmpl w:val="08EA6EF6"/>
@@ -2117,7 +3150,7 @@
       </w:rPr>
     </w:lvl>
   </w:abstractNum>
-  <w:abstractNum w:abstractNumId="6" w15:restartNumberingAfterBreak="0">
+  <w:abstractNum w:abstractNumId="9" w15:restartNumberingAfterBreak="0">
     <w:nsid w:val="4566190F"/>
     <w:multiLevelType w:val="hybridMultilevel"/>
     <w:tmpl w:val="00FAC2FC"/>
@@ -2230,7 +3263,7 @@
       </w:rPr>
     </w:lvl>
   </w:abstractNum>
-  <w:abstractNum w:abstractNumId="7" w15:restartNumberingAfterBreak="0">
+  <w:abstractNum w:abstractNumId="10" w15:restartNumberingAfterBreak="0">
     <w:nsid w:val="459F2CD1"/>
     <w:multiLevelType w:val="hybridMultilevel"/>
     <w:tmpl w:val="0002BD1C"/>
@@ -2343,7 +3376,7 @@
       </w:rPr>
     </w:lvl>
   </w:abstractNum>
-  <w:abstractNum w:abstractNumId="8" w15:restartNumberingAfterBreak="0">
+  <w:abstractNum w:abstractNumId="11" w15:restartNumberingAfterBreak="0">
     <w:nsid w:val="4DA61550"/>
     <w:multiLevelType w:val="hybridMultilevel"/>
     <w:tmpl w:val="ACB05158"/>
@@ -2456,7 +3489,7 @@
       </w:rPr>
     </w:lvl>
   </w:abstractNum>
-  <w:abstractNum w:abstractNumId="9" w15:restartNumberingAfterBreak="0">
+  <w:abstractNum w:abstractNumId="12" w15:restartNumberingAfterBreak="0">
     <w:nsid w:val="51614932"/>
     <w:multiLevelType w:val="hybridMultilevel"/>
     <w:tmpl w:val="5A7CCB16"/>
@@ -2545,7 +3578,7 @@
       </w:pPr>
     </w:lvl>
   </w:abstractNum>
-  <w:abstractNum w:abstractNumId="10" w15:restartNumberingAfterBreak="0">
+  <w:abstractNum w:abstractNumId="13" w15:restartNumberingAfterBreak="0">
     <w:nsid w:val="54A62147"/>
     <w:multiLevelType w:val="hybridMultilevel"/>
     <w:tmpl w:val="B6849182"/>
@@ -2658,7 +3691,7 @@
       </w:rPr>
     </w:lvl>
   </w:abstractNum>
-  <w:abstractNum w:abstractNumId="11" w15:restartNumberingAfterBreak="0">
+  <w:abstractNum w:abstractNumId="14" w15:restartNumberingAfterBreak="0">
     <w:nsid w:val="5E5D72D5"/>
     <w:multiLevelType w:val="hybridMultilevel"/>
     <w:tmpl w:val="5A7CCB16"/>
@@ -2747,7 +3780,7 @@
       </w:pPr>
     </w:lvl>
   </w:abstractNum>
-  <w:abstractNum w:abstractNumId="12" w15:restartNumberingAfterBreak="0">
+  <w:abstractNum w:abstractNumId="15" w15:restartNumberingAfterBreak="0">
     <w:nsid w:val="601C69AE"/>
     <w:multiLevelType w:val="hybridMultilevel"/>
     <w:tmpl w:val="EE944DE4"/>
@@ -2833,7 +3866,7 @@
       </w:pPr>
     </w:lvl>
   </w:abstractNum>
-  <w:abstractNum w:abstractNumId="13" w15:restartNumberingAfterBreak="0">
+  <w:abstractNum w:abstractNumId="16" w15:restartNumberingAfterBreak="0">
     <w:nsid w:val="641415EE"/>
     <w:multiLevelType w:val="hybridMultilevel"/>
     <w:tmpl w:val="E7B48946"/>
@@ -2946,7 +3979,7 @@
       </w:rPr>
     </w:lvl>
   </w:abstractNum>
-  <w:abstractNum w:abstractNumId="14" w15:restartNumberingAfterBreak="0">
+  <w:abstractNum w:abstractNumId="17" w15:restartNumberingAfterBreak="0">
     <w:nsid w:val="6EBE2FAD"/>
     <w:multiLevelType w:val="hybridMultilevel"/>
     <w:tmpl w:val="B328BBA6"/>
@@ -3059,7 +4092,93 @@
       </w:rPr>
     </w:lvl>
   </w:abstractNum>
-  <w:abstractNum w:abstractNumId="15" w15:restartNumberingAfterBreak="0">
+  <w:abstractNum w:abstractNumId="18" w15:restartNumberingAfterBreak="0">
+    <w:nsid w:val="7414064E"/>
+    <w:multiLevelType w:val="hybridMultilevel"/>
+    <w:tmpl w:val="2AC07654"/>
+    <w:lvl w:ilvl="0" w:tplc="FFFFFFFF">
+      <w:start w:val="1"/>
+      <w:numFmt w:val="decimal"/>
+      <w:lvlText w:val="%1."/>
+      <w:lvlJc w:val="left"/>
+      <w:pPr>
+        <w:ind w:left="720" w:hanging="360"/>
+      </w:pPr>
+    </w:lvl>
+    <w:lvl w:ilvl="1" w:tplc="20000019" w:tentative="1">
+      <w:start w:val="1"/>
+      <w:numFmt w:val="lowerLetter"/>
+      <w:lvlText w:val="%2."/>
+      <w:lvlJc w:val="left"/>
+      <w:pPr>
+        <w:ind w:left="1440" w:hanging="360"/>
+      </w:pPr>
+    </w:lvl>
+    <w:lvl w:ilvl="2" w:tplc="2000001B" w:tentative="1">
+      <w:start w:val="1"/>
+      <w:numFmt w:val="lowerRoman"/>
+      <w:lvlText w:val="%3."/>
+      <w:lvlJc w:val="right"/>
+      <w:pPr>
+        <w:ind w:left="2160" w:hanging="180"/>
+      </w:pPr>
+    </w:lvl>
+    <w:lvl w:ilvl="3" w:tplc="2000000F" w:tentative="1">
+      <w:start w:val="1"/>
+      <w:numFmt w:val="decimal"/>
+      <w:lvlText w:val="%4."/>
+      <w:lvlJc w:val="left"/>
+      <w:pPr>
+        <w:ind w:left="2880" w:hanging="360"/>
+      </w:pPr>
+    </w:lvl>
+    <w:lvl w:ilvl="4" w:tplc="20000019" w:tentative="1">
+      <w:start w:val="1"/>
+      <w:numFmt w:val="lowerLetter"/>
+      <w:lvlText w:val="%5."/>
+      <w:lvlJc w:val="left"/>
+      <w:pPr>
+        <w:ind w:left="3600" w:hanging="360"/>
+      </w:pPr>
+    </w:lvl>
+    <w:lvl w:ilvl="5" w:tplc="2000001B" w:tentative="1">
+      <w:start w:val="1"/>
+      <w:numFmt w:val="lowerRoman"/>
+      <w:lvlText w:val="%6."/>
+      <w:lvlJc w:val="right"/>
+      <w:pPr>
+        <w:ind w:left="4320" w:hanging="180"/>
+      </w:pPr>
+    </w:lvl>
+    <w:lvl w:ilvl="6" w:tplc="2000000F" w:tentative="1">
+      <w:start w:val="1"/>
+      <w:numFmt w:val="decimal"/>
+      <w:lvlText w:val="%7."/>
+      <w:lvlJc w:val="left"/>
+      <w:pPr>
+        <w:ind w:left="5040" w:hanging="360"/>
+      </w:pPr>
+    </w:lvl>
+    <w:lvl w:ilvl="7" w:tplc="20000019" w:tentative="1">
+      <w:start w:val="1"/>
+      <w:numFmt w:val="lowerLetter"/>
+      <w:lvlText w:val="%8."/>
+      <w:lvlJc w:val="left"/>
+      <w:pPr>
+        <w:ind w:left="5760" w:hanging="360"/>
+      </w:pPr>
+    </w:lvl>
+    <w:lvl w:ilvl="8" w:tplc="2000001B" w:tentative="1">
+      <w:start w:val="1"/>
+      <w:numFmt w:val="lowerRoman"/>
+      <w:lvlText w:val="%9."/>
+      <w:lvlJc w:val="right"/>
+      <w:pPr>
+        <w:ind w:left="6480" w:hanging="180"/>
+      </w:pPr>
+    </w:lvl>
+  </w:abstractNum>
+  <w:abstractNum w:abstractNumId="19" w15:restartNumberingAfterBreak="0">
     <w:nsid w:val="7F0C426E"/>
     <w:multiLevelType w:val="hybridMultilevel"/>
     <w:tmpl w:val="5A7CCB16"/>
@@ -3149,52 +4268,64 @@
     </w:lvl>
   </w:abstractNum>
   <w:num w:numId="1" w16cid:durableId="441874644">
+    <w:abstractNumId w:val="3"/>
+  </w:num>
+  <w:num w:numId="2" w16cid:durableId="502430955">
+    <w:abstractNumId w:val="1"/>
+  </w:num>
+  <w:num w:numId="3" w16cid:durableId="1329483074">
+    <w:abstractNumId w:val="5"/>
+  </w:num>
+  <w:num w:numId="4" w16cid:durableId="564684261">
+    <w:abstractNumId w:val="13"/>
+  </w:num>
+  <w:num w:numId="5" w16cid:durableId="1031683735">
+    <w:abstractNumId w:val="19"/>
+  </w:num>
+  <w:num w:numId="6" w16cid:durableId="1051417681">
+    <w:abstractNumId w:val="12"/>
+  </w:num>
+  <w:num w:numId="7" w16cid:durableId="1655835745">
+    <w:abstractNumId w:val="4"/>
+  </w:num>
+  <w:num w:numId="8" w16cid:durableId="561402879">
+    <w:abstractNumId w:val="14"/>
+  </w:num>
+  <w:num w:numId="9" w16cid:durableId="9576913">
     <w:abstractNumId w:val="2"/>
   </w:num>
-  <w:num w:numId="2" w16cid:durableId="502430955">
+  <w:num w:numId="10" w16cid:durableId="430052807">
+    <w:abstractNumId w:val="8"/>
+  </w:num>
+  <w:num w:numId="11" w16cid:durableId="836115099">
+    <w:abstractNumId w:val="17"/>
+  </w:num>
+  <w:num w:numId="12" w16cid:durableId="210268766">
+    <w:abstractNumId w:val="9"/>
+  </w:num>
+  <w:num w:numId="13" w16cid:durableId="211970040">
+    <w:abstractNumId w:val="16"/>
+  </w:num>
+  <w:num w:numId="14" w16cid:durableId="1401947914">
+    <w:abstractNumId w:val="10"/>
+  </w:num>
+  <w:num w:numId="15" w16cid:durableId="826827677">
+    <w:abstractNumId w:val="11"/>
+  </w:num>
+  <w:num w:numId="16" w16cid:durableId="737940349">
+    <w:abstractNumId w:val="15"/>
+  </w:num>
+  <w:num w:numId="17" w16cid:durableId="1049768169">
     <w:abstractNumId w:val="0"/>
   </w:num>
-  <w:num w:numId="3" w16cid:durableId="1329483074">
-    <w:abstractNumId w:val="4"/>
-  </w:num>
-  <w:num w:numId="4" w16cid:durableId="564684261">
-    <w:abstractNumId w:val="10"/>
-  </w:num>
-  <w:num w:numId="5" w16cid:durableId="1031683735">
-    <w:abstractNumId w:val="15"/>
-  </w:num>
-  <w:num w:numId="6" w16cid:durableId="1051417681">
-    <w:abstractNumId w:val="9"/>
-  </w:num>
-  <w:num w:numId="7" w16cid:durableId="1655835745">
-    <w:abstractNumId w:val="3"/>
-  </w:num>
-  <w:num w:numId="8" w16cid:durableId="561402879">
-    <w:abstractNumId w:val="11"/>
-  </w:num>
-  <w:num w:numId="9" w16cid:durableId="9576913">
-    <w:abstractNumId w:val="1"/>
-  </w:num>
-  <w:num w:numId="10" w16cid:durableId="430052807">
-    <w:abstractNumId w:val="5"/>
-  </w:num>
-  <w:num w:numId="11" w16cid:durableId="836115099">
-    <w:abstractNumId w:val="14"/>
-  </w:num>
-  <w:num w:numId="12" w16cid:durableId="210268766">
+  <w:num w:numId="18" w16cid:durableId="894462602">
     <w:abstractNumId w:val="6"/>
   </w:num>
-  <w:num w:numId="13" w16cid:durableId="211970040">
-    <w:abstractNumId w:val="13"/>
+  <w:num w:numId="19" w16cid:durableId="1769500388">
+    <w:abstractNumId w:val="18"/>
   </w:num>
-  <w:num w:numId="14" w16cid:durableId="1401947914">
+  <w:num w:numId="20" w16cid:durableId="699478530">
     <w:abstractNumId w:val="7"/>
-  </w:num>
-  <w:num w:numId="15" w16cid:durableId="826827677">
-    <w:abstractNumId w:val="8"/>
-  </w:num>
-  <w:num w:numId="16" w16cid:durableId="737940349">
-    <w:abstractNumId w:val="12"/>
   </w:num>
 </w:numbering>
 </file>

</xml_diff>